<commit_message>
versión final de la primera entrega
</commit_message>
<xml_diff>
--- a/Bitacora del Proyecto final.docx
+++ b/Bitacora del Proyecto final.docx
@@ -1,6 +1,6 @@
 
 <file path=word/document.xml><?xml version="1.0" encoding="utf-8"?>
-<w:document xmlns:wpc="http://schemas.microsoft.com/office/word/2010/wordprocessingCanvas" xmlns:cx="http://schemas.microsoft.com/office/drawing/2014/chartex" xmlns:cx1="http://schemas.microsoft.com/office/drawing/2015/9/8/chartex" xmlns:cx2="http://schemas.microsoft.com/office/drawing/2015/10/21/chartex" xmlns:cx3="http://schemas.microsoft.com/office/drawing/2016/5/9/chartex" xmlns:cx4="http://schemas.microsoft.com/office/drawing/2016/5/10/chartex" xmlns:cx5="http://schemas.microsoft.com/office/drawing/2016/5/11/chartex" xmlns:cx6="http://schemas.microsoft.com/office/drawing/2016/5/12/chartex" xmlns:cx7="http://schemas.microsoft.com/office/drawing/2016/5/13/chartex" xmlns:cx8="http://schemas.microsoft.com/office/drawing/2016/5/14/chartex" xmlns:mc="http://schemas.openxmlformats.org/markup-compatibility/2006" xmlns:aink="http://schemas.microsoft.com/office/drawing/2016/ink" xmlns:am3d="http://schemas.microsoft.com/office/drawing/2017/model3d" xmlns:o="urn:schemas-microsoft-com:office:office" xmlns:oel="http://schemas.microsoft.com/office/2019/extlst" xmlns:r="http://schemas.openxmlformats.org/officeDocument/2006/relationships" xmlns:m="http://schemas.openxmlformats.org/officeDocument/2006/math" xmlns:v="urn:schemas-microsoft-com:vml" xmlns:wp14="http://schemas.microsoft.com/office/word/2010/wordprocessingDrawing" xmlns:wp="http://schemas.openxmlformats.org/drawingml/2006/wordprocessingDrawing" xmlns:w10="urn:schemas-microsoft-com:office:word" xmlns:w="http://schemas.openxmlformats.org/wordprocessingml/2006/main" xmlns:w14="http://schemas.microsoft.com/office/word/2010/wordml" xmlns:w15="http://schemas.microsoft.com/office/word/2012/wordml" xmlns:w16cex="http://schemas.microsoft.com/office/word/2018/wordml/cex" xmlns:w16cid="http://schemas.microsoft.com/office/word/2016/wordml/cid" xmlns:w16="http://schemas.microsoft.com/office/word/2018/wordml" xmlns:w16du="http://schemas.microsoft.com/office/word/2023/wordml/word16du" xmlns:w16sdtdh="http://schemas.microsoft.com/office/word/2020/wordml/sdtdatahash" xmlns:w16sdtfl="http://schemas.microsoft.com/office/word/2024/wordml/sdtformatlock" xmlns:w16se="http://schemas.microsoft.com/office/word/2015/wordml/symex" xmlns:wpg="http://schemas.microsoft.com/office/word/2010/wordprocessingGroup" xmlns:wpi="http://schemas.microsoft.com/office/word/2010/wordprocessingInk" xmlns:wne="http://schemas.microsoft.com/office/word/2006/wordml" xmlns:wps="http://schemas.microsoft.com/office/word/2010/wordprocessingShape" mc:Ignorable="w14 w15 w16se w16cid w16 w16cex w16sdtdh w16sdtfl w16du wp14">
+<w:document xmlns:wpc="http://schemas.microsoft.com/office/word/2010/wordprocessingCanvas" xmlns:cx="http://schemas.microsoft.com/office/drawing/2014/chartex" xmlns:cx1="http://schemas.microsoft.com/office/drawing/2015/9/8/chartex" xmlns:cx2="http://schemas.microsoft.com/office/drawing/2015/10/21/chartex" xmlns:cx3="http://schemas.microsoft.com/office/drawing/2016/5/9/chartex" xmlns:cx4="http://schemas.microsoft.com/office/drawing/2016/5/10/chartex" xmlns:cx5="http://schemas.microsoft.com/office/drawing/2016/5/11/chartex" xmlns:cx6="http://schemas.microsoft.com/office/drawing/2016/5/12/chartex" xmlns:cx7="http://schemas.microsoft.com/office/drawing/2016/5/13/chartex" xmlns:cx8="http://schemas.microsoft.com/office/drawing/2016/5/14/chartex" xmlns:mc="http://schemas.openxmlformats.org/markup-compatibility/2006" xmlns:aink="http://schemas.microsoft.com/office/drawing/2016/ink" xmlns:am3d="http://schemas.microsoft.com/office/drawing/2017/model3d" xmlns:o="urn:schemas-microsoft-com:office:office" xmlns:r="http://schemas.openxmlformats.org/officeDocument/2006/relationships" xmlns:m="http://schemas.openxmlformats.org/officeDocument/2006/math" xmlns:v="urn:schemas-microsoft-com:vml" xmlns:wp14="http://schemas.microsoft.com/office/word/2010/wordprocessingDrawing" xmlns:wp="http://schemas.openxmlformats.org/drawingml/2006/wordprocessingDrawing" xmlns:w10="urn:schemas-microsoft-com:office:word" xmlns:w="http://schemas.openxmlformats.org/wordprocessingml/2006/main" xmlns:w14="http://schemas.microsoft.com/office/word/2010/wordml" xmlns:w15="http://schemas.microsoft.com/office/word/2012/wordml" xmlns:w16cex="http://schemas.microsoft.com/office/word/2018/wordml/cex" xmlns:w16cid="http://schemas.microsoft.com/office/word/2016/wordml/cid" xmlns:w16="http://schemas.microsoft.com/office/word/2018/wordml" xmlns:w16sdtdh="http://schemas.microsoft.com/office/word/2020/wordml/sdtdatahash" xmlns:w16se="http://schemas.microsoft.com/office/word/2015/wordml/symex" xmlns:wpg="http://schemas.microsoft.com/office/word/2010/wordprocessingGroup" xmlns:wpi="http://schemas.microsoft.com/office/word/2010/wordprocessingInk" xmlns:wne="http://schemas.microsoft.com/office/word/2006/wordml" xmlns:wps="http://schemas.microsoft.com/office/word/2010/wordprocessingShape" mc:Ignorable="w14 w15 w16se w16cid w16 w16cex w16sdtdh wp14">
   <w:body>
     <w:p>
       <w:pPr>
@@ -298,6 +298,12 @@
           <w:lang w:val="es-CO"/>
         </w:rPr>
       </w:pPr>
+      <w:r>
+        <w:rPr>
+          <w:lang w:val="es-CO"/>
+        </w:rPr>
+        <w:t>Sábado 16 de mayo: Antes de entregar el documento Yura y Juan José se reunieron por última vez para revisar y terminar de chequear las especificaciones del problema, encontramos unas inconsistencias entre lo que decíamos y luego lo que analizábamos en los casos de prueba. Fuimos muy rigurosos siendo conscientes de que las especificaciones no tienen que basarse en un caso de prueba especifico (como el que nosotros planteamos) si no que tienen que basarse en hacer una cobertura correcta de todas las posibilidades del problema, esto porque nada nos asegura que los casos de prueba finales de este programa sean iguales a los que usamos nosotros para hacer nuestro análisis.</w:t>
+      </w:r>
     </w:p>
     <w:sectPr>
       <w:pgSz w:w="12240" w:h="15840"/>
@@ -310,7 +316,7 @@
 </file>
 
 <file path=word/styles.xml><?xml version="1.0" encoding="utf-8"?>
-<w:styles xmlns:mc="http://schemas.openxmlformats.org/markup-compatibility/2006" xmlns:r="http://schemas.openxmlformats.org/officeDocument/2006/relationships" xmlns:w="http://schemas.openxmlformats.org/wordprocessingml/2006/main" xmlns:w14="http://schemas.microsoft.com/office/word/2010/wordml" xmlns:w15="http://schemas.microsoft.com/office/word/2012/wordml" xmlns:w16cex="http://schemas.microsoft.com/office/word/2018/wordml/cex" xmlns:w16cid="http://schemas.microsoft.com/office/word/2016/wordml/cid" xmlns:w16="http://schemas.microsoft.com/office/word/2018/wordml" xmlns:w16du="http://schemas.microsoft.com/office/word/2023/wordml/word16du" xmlns:w16sdtdh="http://schemas.microsoft.com/office/word/2020/wordml/sdtdatahash" xmlns:w16sdtfl="http://schemas.microsoft.com/office/word/2024/wordml/sdtformatlock" xmlns:w16se="http://schemas.microsoft.com/office/word/2015/wordml/symex" mc:Ignorable="w14 w15 w16se w16cid w16 w16cex w16sdtdh w16sdtfl w16du">
+<w:styles xmlns:mc="http://schemas.openxmlformats.org/markup-compatibility/2006" xmlns:r="http://schemas.openxmlformats.org/officeDocument/2006/relationships" xmlns:w="http://schemas.openxmlformats.org/wordprocessingml/2006/main" xmlns:w14="http://schemas.microsoft.com/office/word/2010/wordml" xmlns:w15="http://schemas.microsoft.com/office/word/2012/wordml" xmlns:w16cex="http://schemas.microsoft.com/office/word/2018/wordml/cex" xmlns:w16cid="http://schemas.microsoft.com/office/word/2016/wordml/cid" xmlns:w16="http://schemas.microsoft.com/office/word/2018/wordml" xmlns:w16sdtdh="http://schemas.microsoft.com/office/word/2020/wordml/sdtdatahash" xmlns:w16se="http://schemas.microsoft.com/office/word/2015/wordml/symex" mc:Ignorable="w14 w15 w16se w16cid w16 w16cex w16sdtdh">
   <w:docDefaults>
     <w:rPrDefault>
       <w:rPr>

</xml_diff>